<commit_message>
Refine CS1105 Unit 1 assignment: buffer-gate design + second source
- Assignment: make single-buffer gate the primary final design (matches
  the Logisim circuit built), keep 0-gate note as theoretical minimum
- Add second credible source (Harris & Harris, 2012) cited in-text and
  in references to strengthen the Sources rubric row
- Rewrite Logisim_Build_Guide as a beginner click-by-click walkthrough
- Regenerate assignment and discussion .docx to match
</commit_message>
<xml_diff>
--- a/CS1105_Digital_Electronics_Architecture/Unit1_Introduction_Digital_Design/Assignment/Unit1_Assignment_Activity.docx
+++ b/CS1105_Digital_Electronics_Architecture/Unit1_Introduction_Digital_Design/Assignment/Unit1_Assignment_Activity.docx
@@ -537,7 +537,7 @@
           <w:b w:val="0"/>
           <w:sz w:val="24"/>
         </w:rPr>
-        <w:t>The result reduces to L = S, the identity law in its simplest form: a variable passed through unchanged equals itself. I can also verify there is no hidden redundancy using the complement law (S + S′ = 1 and S·S′ = 0), which shows the output depends on S alone and never on its inverse. Because the output must always equal the input, no AND, OR, or NOT operation is needed; any added gate would only introduce cost and delay without changing the logic. This is the most efficient result: L = S uses the fewest gates, which is zero logic gates, since the switch drives the bulb directly.</w:t>
+        <w:t>The result reduces to L = S, the identity law in its simplest form: a variable passed through unchanged equals itself. Harris and Harris (2012) note that Boolean algebra lets designers reduce an expression to the smallest number of gates before implementation, which is exactly the simplification performed here. I can also verify there is no hidden redundancy using the complement law (S + S′ = 1 and S·S′ = 0), which shows the output depends on S alone and never on its inverse. Because the output must always equal the input, no AND, OR, or NOT operation is needed; any added gate would only introduce cost and delay without changing the logic. This is the most efficient result: L = S uses the fewest gates, which is zero logic gates, since the switch drives the bulb directly.</w:t>
       </w:r>
     </w:p>
     <w:p>
@@ -580,7 +580,7 @@
           <w:b w:val="0"/>
           <w:sz w:val="24"/>
         </w:rPr>
-        <w:t>The final circuit is a direct connection from the switch to the bulb, optionally through a single buffer:</w:t>
+        <w:t>Because the assignment asks me to clearly depict the logic gate used, my final design implements L = S with a single buffer gate. The switch S connects to the buffer's input, and the buffer's output drives the bulb L:</w:t>
       </w:r>
     </w:p>
     <w:p>
@@ -593,20 +593,7 @@
           <w:rFonts w:ascii="Courier New" w:hAnsi="Courier New"/>
           <w:sz w:val="20"/>
         </w:rPr>
-        <w:t>S (switch) ----------------&gt; L (bulb)      [minimal: direct, 0 gates]</w:t>
-      </w:r>
-    </w:p>
-    <w:p>
-      <w:pPr>
-        <w:spacing w:line="240" w:lineRule="auto" w:after="0"/>
-        <w:ind w:left="720"/>
-      </w:pPr>
-      <w:r>
-        <w:rPr>
-          <w:rFonts w:ascii="Courier New" w:hAnsi="Courier New"/>
-          <w:sz w:val="20"/>
-        </w:rPr>
-        <w:t>S (switch) ----|&gt;----------&gt; L (bulb)      [if a gate is required: 1 buffer]</w:t>
+        <w:t>S (switch) ----|&gt;----------&gt; L (bulb)      [1 buffer gate]</w:t>
       </w:r>
     </w:p>
     <w:p>
@@ -633,7 +620,21 @@
           <w:b w:val="0"/>
           <w:sz w:val="24"/>
         </w:rPr>
-        <w:t>When S = 1 (switch closed), the logic 1 passes to L and the bulb turns on. When S = 0 (switch open), the logic 0 passes to L and the bulb stays off.</w:t>
+        <w:t>The buffer is the single most efficient gate for this task: its output always equals its input (L = S), so it satisfies the required behavior with just one gate while keeping the signal clean. In the strictest sense, the logic L = S needs zero gates (a direct wire), but using one buffer gives a visible, self-contained logic component that matches the assignment's request to depict a gate.</w:t>
+      </w:r>
+    </w:p>
+    <w:p>
+      <w:pPr>
+        <w:spacing w:line="360" w:lineRule="auto" w:after="120"/>
+        <w:ind w:firstLine="0"/>
+      </w:pPr>
+      <w:r>
+        <w:rPr>
+          <w:rFonts w:ascii="Times New Roman" w:hAnsi="Times New Roman"/>
+          <w:b w:val="0"/>
+          <w:sz w:val="24"/>
+        </w:rPr>
+        <w:t>When S = 1 (switch closed), the buffer passes logic 1 to L and the bulb turns on. When S = 0 (switch open), the buffer passes logic 0 to L and the bulb stays off. The Logisim screenshot below shows this circuit in operation, with the switch closed (S = 1) and the bulb lit.</w:t>
       </w:r>
     </w:p>
     <w:p>
@@ -676,7 +677,7 @@
           <w:b w:val="0"/>
           <w:sz w:val="24"/>
         </w:rPr>
-        <w:t>The scenario asks for the fewest gates for simplicity and efficiency. Boolean simplification shows the function is L = S, so the ideal implementation needs no logic gate at all; the switch controls the bulb directly. Where a physical design calls for buffering, one buffer is minimal and appropriate because it preserves the logic value while strengthening the signal. Choosing more, such as an AND gate with both inputs tied to S (S · S = S) or a double inverter, would satisfy the truth table but waste gates, contradicting the efficiency requirement (Ndjountche, 2016).</w:t>
+        <w:t>The scenario asks for the fewest gates for simplicity and efficiency. Boolean simplification shows the function is L = S, so a single buffer gate is the minimal component that both implements the logic and gives a clear gate to depict. A buffer is ideal because its output equals its input, preserving the logic value while keeping the signal clean. Choosing more, such as an AND gate with both inputs tied to S (S · S = S) or two inverters in series ((S′)′ = S), would satisfy the truth table but waste gates, contradicting the efficiency requirement (Ndjountche, 2016). Harris and Harris (2012) likewise emphasize using the simplest gate arrangement that meets the specification.</w:t>
       </w:r>
     </w:p>
     <w:p>
@@ -698,6 +699,36 @@
           <w:sz w:val="28"/>
         </w:rPr>
         <w:t>References</w:t>
+      </w:r>
+    </w:p>
+    <w:p>
+      <w:pPr>
+        <w:spacing w:line="360" w:lineRule="auto" w:after="120"/>
+        <w:ind w:left="720" w:hanging="720"/>
+      </w:pPr>
+      <w:r>
+        <w:rPr>
+          <w:rFonts w:ascii="Times New Roman" w:hAnsi="Times New Roman"/>
+          <w:i w:val="0"/>
+          <w:sz w:val="24"/>
+        </w:rPr>
+        <w:t xml:space="preserve">Harris, D. M., &amp; Harris, S. L. (2012). </w:t>
+      </w:r>
+      <w:r>
+        <w:rPr>
+          <w:rFonts w:ascii="Times New Roman" w:hAnsi="Times New Roman"/>
+          <w:i/>
+          <w:sz w:val="24"/>
+        </w:rPr>
+        <w:t>Digital design and computer architecture</w:t>
+      </w:r>
+      <w:r>
+        <w:rPr>
+          <w:rFonts w:ascii="Times New Roman" w:hAnsi="Times New Roman"/>
+          <w:i w:val="0"/>
+          <w:sz w:val="24"/>
+        </w:rPr>
+        <w:t xml:space="preserve"> (2nd ed.). Morgan Kaufmann.</w:t>
       </w:r>
     </w:p>
     <w:p>

</xml_diff>